<commit_message>
fix: publish v1050 delivery clarification flow
</commit_message>
<xml_diff>
--- a/docs/maintenance/AI开发项目_Bug记录模板.docx
+++ b/docs/maintenance/AI开发项目_Bug记录模板.docx
@@ -12401,6 +12401,39 @@
     <w:p>
       <w:r>
         <w:t>验证：网页与私人 bundle 关键代码同步；专项测试覆盖自主选择、不把检索词当硬条件、具体规格失败说明、头像顶部对齐和双方尖角。完整自动化、安装包结构、Mac 编译签名与真机验收按发布流程另行记录。</w:t>
+      </w:r>
+    </w:p>
+    <w:p>
+      <w:r>
+        <w:br w:type="page"/>
+      </w:r>
+    </w:p>
+    <w:p>
+      <w:r>
+        <w:rPr>
+          <w:b/>
+        </w:rPr>
+        <w:t>v1050 补充｜套餐提示被误识别为规格及缺少热饮时直接失败（2026-08-23）</w:t>
+      </w:r>
+    </w:p>
+    <w:p>
+      <w:r>
+        <w:t>现象：双杯或套餐商品弹层中的“已选、价格计算中、请选择 2 份、选规格”等提示文字被错误当成饮品选项，导致规格结构异常；商品没有热饮时流程直接失败，用户不知道该如何继续。</w:t>
+      </w:r>
+    </w:p>
+    <w:p>
+      <w:r>
+        <w:t>根因：浏览器解析器把规格弹层所有叶子文字等价处理，没有分离标题、选择数量提示和真实可点击选项；规格模型虽读取长期偏好，但缺少可恢复的澄清状态。</w:t>
+      </w:r>
+    </w:p>
+    <w:p>
+      <w:r>
+        <w:t>处理：新增规格噪声清洗、请选择 N 份计数保留和精确数量校验；新增每角色隔离的 30 分钟规格澄清状态。缺少关键温度／糖度等规格时先停止加购，由真实角色模型自然提问；用户换商品后丢弃旧报价并重新搜索一次。</w:t>
+      </w:r>
+    </w:p>
+    <w:p>
+      <w:r>
+        <w:t>验证：网页与私人 PhoneWeb.bundle 的 delivery.js 哈希一致；浏览器服务专项 29/29、真实外卖交接专项通过、项目全量 973/973；本地服务重启后 health、登录态和默认地址能力均正常。付款、验证码和平台风控仍保持本人确认边界。</w:t>
       </w:r>
     </w:p>
     <w:sectPr>

</xml_diff>

<commit_message>
fix: publish v1051 delivery shop search and title badge colors
</commit_message>
<xml_diff>
--- a/docs/maintenance/AI开发项目_Bug记录模板.docx
+++ b/docs/maintenance/AI开发项目_Bug记录模板.docx
@@ -12434,6 +12434,34 @@
     <w:p>
       <w:r>
         <w:t>验证：网页与私人 PhoneWeb.bundle 的 delivery.js 哈希一致；浏览器服务专项 29/29、真实外卖交接专项通过、项目全量 973/973；本地服务重启后 health、登录态和默认地址能力均正常。付款、验证码和平台风控仍保持本人确认边界。</w:t>
+      </w:r>
+    </w:p>
+    <w:p>
+      <w:pPr>
+        <w:pStyle w:val="Heading1"/>
+      </w:pPr>
+      <w:r>
+        <w:t>v1051 候选：首页模糊命中跳过店内搜索、加购后无结算与项圈不可配色（2026-08-23）</w:t>
+      </w:r>
+    </w:p>
+    <w:p>
+      <w:r>
+        <w:t>现象：平台外层搜索或门店首页只要出现名称近似的推荐商品，就会跳过店内搜索，导致用户明确说出的奶茶仍可能找不到；商品加入购物车后若金额不足起送价，页面没有“去结算”，角色也没有可恢复状态，用户只看到操作停住。</w:t>
+      </w:r>
+    </w:p>
+    <w:p>
+      <w:r>
+        <w:t>原因：旧流程把门店首页商品卡同时当作候选门店发现和最终商品目录；缺少店内搜索的固定第二阶段。结算按钮缺失时只返回通用错误，没有解析起送金额、差额与可恢复数量。微信归属头衔只有显示开关，CSS 颜色为固定默认值。</w:t>
+      </w:r>
+    </w:p>
+    <w:p>
+      <w:r>
+        <w:t>修复：每个候选门店执行一次真实店内商品搜索；缺少结算按钮时解析真实起送限制并撤回失败加购，随后保存同款续单状态，由角色按人设询问增加数量或换店。微信设置增加项圈气泡颜色与字体颜色，标题小气泡通过受限十六进制颜色变量渲染，恢复默认时删除自定义颜色。</w:t>
+      </w:r>
+    </w:p>
+    <w:p>
+      <w:r>
+        <w:t>验证：两份 app.js、wechat-me.js、delivery.js 与外卖浏览器脚本语法通过；网页和私人资源对应实现一致；外卖服务 31/31，完整自动测试 973/973，git diff --check 待最终维护文档写入后复核。未做 Mac 编译、签名及真机支付页验证。</w:t>
       </w:r>
     </w:p>
     <w:sectPr>

</xml_diff>

<commit_message>
fix: limit public North HealthKit to steps
</commit_message>
<xml_diff>
--- a/docs/maintenance/AI开发项目_Bug记录模板.docx
+++ b/docs/maintenance/AI开发项目_Bug记录模板.docx
@@ -13296,6 +13296,34 @@
     <w:p>
       <w:r>
         <w:t>验证：增加“失败时间较新但仍返回上一条真实心声”和“从未成功时保持空白”行为断言；修正图片专项中过度要求整个 renderChat 与未发布私人 bundle 逐字一致的断言，只保留其真正要验证的图片加载契约。全仓 1337/1337 通过。</w:t>
+      </w:r>
+    </w:p>
+    <w:p>
+      <w:pPr>
+        <w:pStyle w:val="Heading1"/>
+      </w:pPr>
+      <w:r>
+        <w:t>公开 North 1.0 (7) 因额外 HealthKit 数据类型被拒｜Guideline 2.5.1（2026-09-04）</w:t>
+      </w:r>
+    </w:p>
+    <w:p>
+      <w:r>
+        <w:t>现象：审核员可以使用演示账号继续测试，但 Apple 指出应用除步数外还请求了其他健康数据，要求将 HealthKit 访问限制为 step count only。</w:t>
+      </w:r>
+    </w:p>
+    <w:p>
+      <w:r>
+        <w:t>确认原因：公开审核工程 CompanionWellnessService.healthReadTypes() 同时包含 stepCount、activeEnergyBurned、heartRate、heartRateVariabilitySDNN、sleepAnalysis 和 iOS 18 stateOfMindType；刷新逻辑也读取并上传对应字段。此前仅在说明中把健康访问描述为可选，没有按公开版实际审核目的执行最小权限。</w:t>
+      </w:r>
+    </w:p>
+    <w:p>
+      <w:r>
+        <w:t>修复：公开版授权集合、查询与快照缩减为今日步数；删除活动能量、心率、HRV、睡眠和心境代码；同步修改界面与公开隐私/支持文字；全部 Target 构建号升至 8。私人版本保持原样。</w:t>
+      </w:r>
+    </w:p>
+    <w:p>
+      <w:r>
+        <w:t>验证：新增 north-public-healthkit-minimal.test.mjs，要求公开 Swift 源码只出现 stepCount 请求和 steps 字段，并禁止十类额外健康标识；同时校验两条只读 HealthKit 用途说明只写今日步数、工程不存在写入用途说明、十处构建号均为 8。Mac 编译、签名、真机授权页和 App Store Connect 上传仍待完成。</w:t>
       </w:r>
     </w:p>
     <w:sectPr>

</xml_diff>

<commit_message>
fix: correct private package version contract
</commit_message>
<xml_diff>
--- a/docs/maintenance/AI开发项目_Bug记录模板.docx
+++ b/docs/maintenance/AI开发项目_Bug记录模板.docx
@@ -14027,6 +14027,11 @@
     <w:p>
       <w:r>
         <w:t xml:space="preserve">2026年9月7日 v1202 私人打包检查：包前Windows全仓1569/1569通过，24份新增共享运行文件与说明对照一致，私人双入口一致，十二组原生版本号均升323。沿用上一阶段网页/私人浏览器模拟模型通过记录；本次仅版本与归档说明调整，未新增业务修复。新增脚本package_v1202_private_ios323.py检查所有嵌套素材、旧核心保护、双入口和最终ZIP字节，生成结果及SHA256以脚本实际输出为准。Mac编译、签名、真实模型、真实iPhone仍未验收。</w:t>
+      </w:r>
+    </w:p>
+    <w:p>
+      <w:r>
+        <w:t>2026年9月7日 v1202 首次归档校验阻止输出：由旧脚本派生新脚本时，版本名替换把“版”写成两次。网页和私人源码APP_VER正确，错误只在打包脚本的预期字符串；未生成ZIP。修正派生规则和当前校验字符串，继续从新干净提交生成归档，保留包内完整性检查，不放宽校验。</w:t>
       </w:r>
     </w:p>
     <w:sectPr>

</xml_diff>

<commit_message>
build: package private v1220 iOS344 homekit and persistence fixes
</commit_message>
<xml_diff>
--- a/docs/maintenance/AI开发项目_Bug记录模板.docx
+++ b/docs/maintenance/AI开发项目_Bug记录模板.docx
@@ -14542,6 +14542,44 @@
     <w:p>
       <w:r>
         <w:t>本次私人仍为Mac待编译源码，不是IPA，尚未Mac编译签名或真实iPhone验收。Word仅追加并保留历史，环境无soffice，视觉渲染未完成。</w:t>
+      </w:r>
+    </w:p>
+    <w:p>
+      <w:pPr>
+        <w:pStyle w:val="Heading2"/>
+      </w:pPr>
+      <w:r>
+        <w:t>2026年9月9日 私人通知头像退化为昵称首字 v1218 未发布候选</w:t>
+      </w:r>
+    </w:p>
+    <w:p>
+      <w:r>
+        <w:t>用户确认聊天头像正常，仅系统后台通知为圆圈内昵称首字，授权直接修复。已核对 v1216 源码 ZIP 通知扩展与当前一致，无源码漏包证据；尚未取得真机失败时图片和网络响应，不能断言此次具体触发原因已证实。</w:t>
+      </w:r>
+    </w:p>
+    <w:p>
+      <w:r>
+        <w:t>历史 v904 已等待 IndexedDB，但未覆盖读取为空、解码失败及超时后生成首字 JPEG 的分支。故障注入旧实现 4 项失败；原 profile RPC 的 avatar_data 无条件更新也在隔离 PostgreSQL 复现空值清除旧图。</w:t>
+      </w:r>
+    </w:p>
+    <w:p>
+      <w:r>
+        <w:t>本次仅私人通知上传启用照片保护模式：读图和解码各有 5 秒上限；配置照片却加载失败时不画字图，读取中头像已更换则不上传旧图；正常图片及主动选择的 emoji/文字仍可更新。好友复用序列化函数不启用新模式，旧回退不变。私人云独立触发器只对带 notificationAvatarPreserve 标记且空头像的更新保留同一行旧图，不改原 RPC 鉴权、记忆和调度，也不跨角色借图。</w:t>
+      </w:r>
+    </w:p>
+    <w:p>
+      <w:r>
+        <w:t>验证：专项 11 项通过；真实私有页面使用真实 IndexedDB、Canvas 像素验证照片上传、坏图空结果、恢复和关闭开关，RPC 隔离模拟。隔离 PostgreSQL 执行原 RPC 与触发器，验证旧错误复现、同角色保留、新图替换、错误密钥拒绝、角色隔离、记忆与定时以及重复迁移。全量 1730 项通过，网页和私人实际页面授权聊天门禁通过、页面错误0。没有真实模型调用或真实账号数据读写。</w:t>
+      </w:r>
+    </w:p>
+    <w:p>
+      <w:r>
+        <w:t>私有网页候选 v1218，原生暂为 iOS342/桥37，未提交、打包、推送、部署或真机验收。发布前必须先把 native/private-small-phone/migrations/202609090001_notification_avatar_preserve.sql 应用到私人云并核验，再分发新客户端；公开网页、公开 North 原生与云不动。图片恢复后下一次资料同步可覆盖旧字图；旧通知不改写，没有历史成功照片时不保证立即有图。通知扩展自身未改。</w:t>
+      </w:r>
+    </w:p>
+    <w:p>
+      <w:r>
+        <w:t>已检查项目说明与 Bug 修改规范：本次为既有通知头像能力的定向故障保护，不新增功能；沿用既有第656段不得因缓存失败上传首字图及跨层验收规则，不改写历史。维护文档仅追加，缺少 bundled soffice 时不能宣称视觉排版验收完成。</w:t>
       </w:r>
     </w:p>
     <w:sectPr>

</xml_diff>

<commit_message>
fix: private v1221 iOS345 optional HomeKit service iteration
</commit_message>
<xml_diff>
--- a/docs/maintenance/AI开发项目_Bug记录模板.docx
+++ b/docs/maintenance/AI开发项目_Bug记录模板.docx
@@ -14580,6 +14580,39 @@
     <w:p>
       <w:r>
         <w:t>已检查项目说明与 Bug 修改规范：本次为既有通知头像能力的定向故障保护，不新增功能；沿用既有第656段不得因缓存失败上传首字图及跨层验收规则，不改写历史。维护文档仅追加，缺少 bundled soffice 时不能宣称视觉排版验收完成。</w:t>
+      </w:r>
+    </w:p>
+    <w:p>
+      <w:pPr>
+        <w:pStyle w:val="Heading2"/>
+      </w:pPr>
+      <w:r>
+        <w:t>2026年9月9日 v1221 私人空调 linkedServices 可空数组编译错误</w:t>
+      </w:r>
+    </w:p>
+    <w:p>
+      <w:r>
+        <w:t>用户在 v1220 Xcode 构建时提供实际红色报错：For-in loop requires [HMService]? to conform to Sequence。HomeKitClimateBridge 第478行直接循环 target.service.linkedServices；Apple HMService 官方定义 linkedServices 为可空数组 [HMService]?。这是新增空调代码缺少解包，不是用户操作、签名或后台部署问题。</w:t>
+      </w:r>
+    </w:p>
+    <w:p>
+      <w:r>
+        <w:t>仅把循环改为 for linked in target.service.linkedServices ?? []。无关联服务时跳过，仍优先直接服务、再检查关联服务、无匹配返回 nil；不强制解包，不改控制白名单、回读和风速权限。检索私人原生仅此处同类循环。截图另外两条黄色并发隔离警告未在此次改动中扩大处理。</w:t>
+      </w:r>
+    </w:p>
+    <w:p>
+      <w:r>
+        <w:t>回归先对旧代码执行，静态防回归1失败1通过；修改后2通过，空调专项12通过，全仓1736通过。网页/私人实际页面既有授权、笔记、原文两态、聊天送达与保存恢复通过，页面错误0。没有 Swift/Xcode 编译器；本次测试只能防已知源码错误，不代表苹果 SDK 编译完成。v1220 出包前缺少 Mac 编译验收导致漏检，后续不得用 Node 测试总数冒充可安装验证。</w:t>
+      </w:r>
+    </w:p>
+    <w:p>
+      <w:r>
+        <w:t>用户授权修复并发新私人包。版本 v1221/iOS1.0.345（345）/原生桥37/诊断334，保留旧包及上一包全部私人家居、存档卡顿和通知修复；公开网页 v1216 和公开 North 未改。私人头像保护后台迁移仍未授权部署，包中保留前置说明；非签名IPA，Mac与真机待验。项目说明无新增功能、Bug规范沿用已有原生编译与发布门禁，未重写历史。</w:t>
+      </w:r>
+    </w:p>
+    <w:p>
+      <w:r>
+        <w:t>文档按维护技能仅追加并核验既有段落完全保留；当前 bundled soffice 不可用，渲染失败不视为视觉排版验收通过。实际包文件数、提交与哈希写在父目录私人打包结果_v1221_2026-09-09.md。</w:t>
       </w:r>
     </w:p>
     <w:sectPr>

</xml_diff>